<commit_message>
Löser buggar och fixar med design
</commit_message>
<xml_diff>
--- a/dokumentation/Projektplan_tidapp.docx
+++ b/dokumentation/Projektplan_tidapp.docx
@@ -1665,30 +1665,12 @@
     </w:p>
     <w:p>
       <w:r>
-        <w:t xml:space="preserve">I många sammanhang behöver man kunna redovisa hur länge man gjort olika uppgifter för att </w:t>
-      </w:r>
-      <w:proofErr w:type="spellStart"/>
-      <w:proofErr w:type="gramStart"/>
-      <w:r>
-        <w:t>t.ex</w:t>
-      </w:r>
-      <w:proofErr w:type="spellEnd"/>
-      <w:proofErr w:type="gramEnd"/>
-      <w:r>
-        <w:t xml:space="preserve"> kunna fakturera kunder eller visa för en arbetsgivare vad man gjort under en viss tid</w:t>
+        <w:t>I många sammanhang behöver man kunna redovisa hur länge man gjort olika uppgifter för att t.ex kunna fakturera kunder eller visa för en arbetsgivare vad man gjort under en viss tid</w:t>
       </w:r>
     </w:p>
     <w:p>
       <w:r>
-        <w:t xml:space="preserve">Denna </w:t>
-      </w:r>
-      <w:proofErr w:type="spellStart"/>
-      <w:r>
-        <w:t>tidsrapport</w:t>
-      </w:r>
-      <w:proofErr w:type="spellEnd"/>
-      <w:r>
-        <w:t xml:space="preserve"> fyller de viktigaste funktionerna, man kan lägga till </w:t>
+        <w:t xml:space="preserve">Denna tidsrapport fyller de viktigaste funktionerna, man kan lägga till </w:t>
       </w:r>
       <w:r>
         <w:rPr>
@@ -1718,25 +1700,12 @@
         <w:t>Uppgift</w:t>
       </w:r>
       <w:r>
-        <w:t xml:space="preserve">. </w:t>
-      </w:r>
-      <w:proofErr w:type="spellStart"/>
-      <w:r>
-        <w:t>Appen</w:t>
-      </w:r>
-      <w:proofErr w:type="spellEnd"/>
-      <w:r>
-        <w:t xml:space="preserve"> ska också kunna visa en sammanställning där total tid man gjort olika aktiviteter sammanräknas.</w:t>
+        <w:t>. Appen ska också kunna visa en sammanställning där total tid man gjort olika aktiviteter sammanräknas.</w:t>
       </w:r>
     </w:p>
     <w:p>
-      <w:proofErr w:type="spellStart"/>
-      <w:r>
-        <w:t>Appen</w:t>
-      </w:r>
-      <w:proofErr w:type="spellEnd"/>
-      <w:r>
-        <w:t xml:space="preserve"> ska kunna köras både på mobiler och på stationära datorer, och även surfplattor men anpassningen av skärmstorleken kommer bara att göras efter mobiltelefon eller ”inte mobiltelefon”</w:t>
+      <w:r>
+        <w:t>Appen ska kunna köras både på mobiler och på stationära datorer, och även surfplattor men anpassningen av skärmstorleken kommer bara att göras efter mobiltelefon eller ”inte mobiltelefon”</w:t>
       </w:r>
     </w:p>
     <w:p>
@@ -1774,52 +1743,12 @@
     </w:p>
     <w:p>
       <w:r>
-        <w:t>Applikationen ska utvecklas i html/</w:t>
-      </w:r>
-      <w:proofErr w:type="spellStart"/>
-      <w:r>
-        <w:t>css</w:t>
-      </w:r>
-      <w:proofErr w:type="spellEnd"/>
-      <w:r>
-        <w:t xml:space="preserve"> med </w:t>
-      </w:r>
-      <w:proofErr w:type="spellStart"/>
-      <w:r>
-        <w:t>javascript</w:t>
-      </w:r>
-      <w:proofErr w:type="spellEnd"/>
-      <w:r>
-        <w:t xml:space="preserve"> som anropat ett PHP </w:t>
-      </w:r>
-      <w:proofErr w:type="spellStart"/>
-      <w:r>
-        <w:t>api</w:t>
-      </w:r>
-      <w:proofErr w:type="spellEnd"/>
-      <w:r>
-        <w:t xml:space="preserve">. All utveckling sker lokalt på den egna datorn där miljön är en </w:t>
-      </w:r>
-      <w:proofErr w:type="spellStart"/>
-      <w:r>
-        <w:t>wamp</w:t>
-      </w:r>
-      <w:proofErr w:type="spellEnd"/>
-      <w:r>
-        <w:t xml:space="preserve"> server med php8.3 mySQL9.1 och Apache2.4</w:t>
+        <w:t>Applikationen ska utvecklas i html/css med javascript som anropat ett PHP api. All utveckling sker lokalt på den egna datorn där miljön är en wamp server med php8.3 mySQL9.1 och Apache2.4</w:t>
       </w:r>
     </w:p>
     <w:p>
       <w:r>
-        <w:t xml:space="preserve">Applikationen kommer att publiceras på its.ax som är en </w:t>
-      </w:r>
-      <w:proofErr w:type="spellStart"/>
-      <w:r>
-        <w:t>linux</w:t>
-      </w:r>
-      <w:proofErr w:type="spellEnd"/>
-      <w:r>
-        <w:t>-miljö med samma specifikationer som på den lokala datorn.</w:t>
+        <w:t>Applikationen kommer att publiceras på its.ax som är en linux-miljö med samma specifikationer som på den lokala datorn.</w:t>
       </w:r>
     </w:p>
     <w:p>
@@ -1882,6 +1811,7 @@
         <w:t>Bifoga gärna en testplan!</w:t>
       </w:r>
     </w:p>
+    <w:p/>
     <w:p>
       <w:pPr>
         <w:pStyle w:val="Rubrik1"/>
@@ -1905,33 +1835,7 @@
     </w:p>
     <w:p>
       <w:r>
-        <w:rPr>
-          <w:b/>
-          <w:bCs/>
-        </w:rPr>
-        <w:t>Hur ska de olika skärmbilderna i programmet se ut</w:t>
-      </w:r>
-      <w:r>
-        <w:t>?</w:t>
-      </w:r>
-      <w:r>
-        <w:t xml:space="preserve"> Lägga till o ta bort tidsposter/ en sammanställning på aktivitet och hur länge den gjort/ och en </w:t>
-      </w:r>
-      <w:proofErr w:type="spellStart"/>
-      <w:r>
-        <w:t>tidsinterval</w:t>
-      </w:r>
-      <w:proofErr w:type="spellEnd"/>
-      <w:r>
-        <w:t xml:space="preserve"> som går att </w:t>
-      </w:r>
-      <w:proofErr w:type="spellStart"/>
-      <w:r>
-        <w:t>specifiera</w:t>
-      </w:r>
-      <w:proofErr w:type="spellEnd"/>
-      <w:r>
-        <w:t>/</w:t>
+        <w:t>Dator vy:</w:t>
       </w:r>
     </w:p>
     <w:p>
@@ -1939,6 +1843,102 @@
         <w:pStyle w:val="Rubrik2"/>
       </w:pPr>
       <w:bookmarkStart w:id="8" w:name="_Toc103152775"/>
+      <w:r>
+        <w:drawing>
+          <wp:inline distT="0" distB="0" distL="0" distR="0" wp14:anchorId="0320A77B" wp14:editId="2275740C">
+            <wp:extent cx="6133381" cy="3728085"/>
+            <wp:effectExtent l="0" t="0" r="1270" b="5715"/>
+            <wp:docPr id="1445597548" name="Bildobjekt 1"/>
+            <wp:cNvGraphicFramePr>
+              <a:graphicFrameLocks xmlns:a="http://schemas.openxmlformats.org/drawingml/2006/main" noChangeAspect="1"/>
+            </wp:cNvGraphicFramePr>
+            <a:graphic xmlns:a="http://schemas.openxmlformats.org/drawingml/2006/main">
+              <a:graphicData uri="http://schemas.openxmlformats.org/drawingml/2006/picture">
+                <pic:pic xmlns:pic="http://schemas.openxmlformats.org/drawingml/2006/picture">
+                  <pic:nvPicPr>
+                    <pic:cNvPr id="1445597548" name=""/>
+                    <pic:cNvPicPr/>
+                  </pic:nvPicPr>
+                  <pic:blipFill>
+                    <a:blip r:embed="rId13"/>
+                    <a:stretch>
+                      <a:fillRect/>
+                    </a:stretch>
+                  </pic:blipFill>
+                  <pic:spPr>
+                    <a:xfrm>
+                      <a:off x="0" y="0"/>
+                      <a:ext cx="6138338" cy="3731098"/>
+                    </a:xfrm>
+                    <a:prstGeom prst="rect">
+                      <a:avLst/>
+                    </a:prstGeom>
+                  </pic:spPr>
+                </pic:pic>
+              </a:graphicData>
+            </a:graphic>
+          </wp:inline>
+        </w:drawing>
+      </w:r>
+    </w:p>
+    <w:p>
+      <w:r>
+        <w:t>Mobil vy:</w:t>
+      </w:r>
+    </w:p>
+    <w:p>
+      <w:r>
+        <w:drawing>
+          <wp:inline distT="0" distB="0" distL="0" distR="0" wp14:anchorId="7863BE50" wp14:editId="7EEB6E41">
+            <wp:extent cx="6132830" cy="2769079"/>
+            <wp:effectExtent l="0" t="0" r="1270" b="0"/>
+            <wp:docPr id="316192707" name="Bildobjekt 1"/>
+            <wp:cNvGraphicFramePr>
+              <a:graphicFrameLocks xmlns:a="http://schemas.openxmlformats.org/drawingml/2006/main" noChangeAspect="1"/>
+            </wp:cNvGraphicFramePr>
+            <a:graphic xmlns:a="http://schemas.openxmlformats.org/drawingml/2006/main">
+              <a:graphicData uri="http://schemas.openxmlformats.org/drawingml/2006/picture">
+                <pic:pic xmlns:pic="http://schemas.openxmlformats.org/drawingml/2006/picture">
+                  <pic:nvPicPr>
+                    <pic:cNvPr id="316192707" name=""/>
+                    <pic:cNvPicPr/>
+                  </pic:nvPicPr>
+                  <pic:blipFill>
+                    <a:blip r:embed="rId14"/>
+                    <a:stretch>
+                      <a:fillRect/>
+                    </a:stretch>
+                  </pic:blipFill>
+                  <pic:spPr>
+                    <a:xfrm>
+                      <a:off x="0" y="0"/>
+                      <a:ext cx="6170326" cy="2786009"/>
+                    </a:xfrm>
+                    <a:prstGeom prst="rect">
+                      <a:avLst/>
+                    </a:prstGeom>
+                  </pic:spPr>
+                </pic:pic>
+              </a:graphicData>
+            </a:graphic>
+          </wp:inline>
+        </w:drawing>
+      </w:r>
+    </w:p>
+    <w:p>
+      <w:pPr>
+        <w:pStyle w:val="Rubrik2"/>
+      </w:pPr>
+    </w:p>
+    <w:p>
+      <w:pPr>
+        <w:pStyle w:val="Rubrik2"/>
+      </w:pPr>
+    </w:p>
+    <w:p>
+      <w:pPr>
+        <w:pStyle w:val="Rubrik2"/>
+      </w:pPr>
       <w:r>
         <w:t>Navigering</w:t>
       </w:r>
@@ -1991,13 +1991,8 @@
         <w:t xml:space="preserve"> hanterar programmet? Datatyper, format</w:t>
       </w:r>
       <w:r>
-        <w:t xml:space="preserve">, </w:t>
-      </w:r>
-      <w:proofErr w:type="spellStart"/>
-      <w:r>
-        <w:t>värdeområden</w:t>
-      </w:r>
-      <w:proofErr w:type="spellEnd"/>
+        <w:t>, värdeområden</w:t>
+      </w:r>
       <w:r>
         <w:t>…</w:t>
       </w:r>
@@ -2019,6 +2014,9 @@
     </w:p>
     <w:p>
       <w:r>
+        <w:rPr>
+          <w:noProof/>
+        </w:rPr>
         <w:drawing>
           <wp:inline distT="0" distB="0" distL="0" distR="0" wp14:anchorId="0A8C7A8C" wp14:editId="4A45F1B9">
             <wp:extent cx="5243014" cy="2149026"/>
@@ -2035,7 +2033,7 @@
                     <pic:cNvPicPr/>
                   </pic:nvPicPr>
                   <pic:blipFill>
-                    <a:blip r:embed="rId13"/>
+                    <a:blip r:embed="rId15"/>
                     <a:stretch>
                       <a:fillRect/>
                     </a:stretch>
@@ -2069,76 +2067,10 @@
     </w:p>
     <w:p>
       <w:r>
-        <w:t xml:space="preserve">Databasen har två tabeller, aktiviteter och uppgifter. Tabellen aktiviteter består av två fält </w:t>
-      </w:r>
-      <w:proofErr w:type="gramStart"/>
-      <w:r>
-        <w:t>ett id</w:t>
-      </w:r>
-      <w:proofErr w:type="gramEnd"/>
-      <w:r>
-        <w:t xml:space="preserve"> som är </w:t>
-      </w:r>
-      <w:proofErr w:type="spellStart"/>
-      <w:r>
-        <w:t>autoincrementerat</w:t>
-      </w:r>
-      <w:proofErr w:type="spellEnd"/>
-      <w:r>
-        <w:t xml:space="preserve"> heltal och ett namn, som är ett unikt index. Tabellen uppgifter har också </w:t>
-      </w:r>
-      <w:proofErr w:type="gramStart"/>
-      <w:r>
-        <w:t>ett id</w:t>
-      </w:r>
-      <w:proofErr w:type="gramEnd"/>
-      <w:r>
-        <w:t xml:space="preserve"> som är ett </w:t>
-      </w:r>
-      <w:proofErr w:type="spellStart"/>
-      <w:r>
-        <w:t>autoincremerat</w:t>
-      </w:r>
-      <w:proofErr w:type="spellEnd"/>
-      <w:r>
-        <w:t xml:space="preserve"> heltal, datum sparas i datumformatet år-månad-dag (</w:t>
-      </w:r>
-      <w:proofErr w:type="spellStart"/>
-      <w:proofErr w:type="gramStart"/>
-      <w:r>
-        <w:t>t.ex</w:t>
-      </w:r>
-      <w:proofErr w:type="spellEnd"/>
-      <w:proofErr w:type="gramEnd"/>
-      <w:r>
-        <w:t xml:space="preserve"> 2026-04-22), varaktigheten sparas i timmar och minuter (11:15) eftersom </w:t>
-      </w:r>
-      <w:proofErr w:type="spellStart"/>
-      <w:r>
-        <w:t>mySQL</w:t>
-      </w:r>
-      <w:proofErr w:type="spellEnd"/>
-      <w:r>
-        <w:t xml:space="preserve"> alltid har med sekunder behövs de trimmas bort i samband med </w:t>
-      </w:r>
-      <w:proofErr w:type="spellStart"/>
-      <w:r>
-        <w:t>api</w:t>
-      </w:r>
-      <w:proofErr w:type="spellEnd"/>
-      <w:r>
-        <w:t xml:space="preserve"> förfrågan. Tabellen innehåller också en längre beskrivning som lagras som en text</w:t>
-      </w:r>
-      <w:r>
-        <w:t xml:space="preserve">. I tabellen uppgifter är </w:t>
-      </w:r>
-      <w:proofErr w:type="spellStart"/>
-      <w:r>
-        <w:t>aktivitet_id</w:t>
-      </w:r>
-      <w:proofErr w:type="spellEnd"/>
-      <w:r>
-        <w:t xml:space="preserve"> en främmande nyckel från tabellen aktiviteter.</w:t>
+        <w:t>Databasen har två tabeller, aktiviteter och uppgifter. Tabellen aktiviteter består av två fält ett id som är autoincrementerat heltal och ett namn, som är ett unikt index. Tabellen uppgifter har också ett id som är ett autoincremerat heltal, datum sparas i datumformatet år-månad-dag (t.ex 2026-04-22), varaktigheten sparas i timmar och minuter (11:15) eftersom mySQL alltid har med sekunder behövs de trimmas bort i samband med api förfrågan. Tabellen innehåller också en längre beskrivning som lagras som en text</w:t>
+      </w:r>
+      <w:r>
+        <w:t>. I tabellen uppgifter är aktivitet_id en främmande nyckel från tabellen aktiviteter.</w:t>
       </w:r>
     </w:p>
     <w:p>
@@ -2146,30 +2078,13 @@
         <w:pStyle w:val="Rubrik2"/>
       </w:pPr>
       <w:r>
-        <w:lastRenderedPageBreak/>
         <w:t>Databas</w:t>
       </w:r>
       <w:bookmarkEnd w:id="13"/>
     </w:p>
     <w:p>
       <w:r>
-        <w:t xml:space="preserve">Databasen är en </w:t>
-      </w:r>
-      <w:proofErr w:type="spellStart"/>
-      <w:r>
-        <w:t>mySQL</w:t>
-      </w:r>
-      <w:proofErr w:type="spellEnd"/>
-      <w:r>
-        <w:t xml:space="preserve"> version 9. </w:t>
-      </w:r>
-      <w:proofErr w:type="spellStart"/>
-      <w:r>
-        <w:t>InnoDB</w:t>
-      </w:r>
-      <w:proofErr w:type="spellEnd"/>
-      <w:r>
-        <w:t xml:space="preserve"> som databasmotor och UTF8mb4 som teckenuppsättning</w:t>
+        <w:t>Databasen är en mySQL version 9. InnoDB som databasmotor och UTF8mb4 som teckenuppsättning</w:t>
       </w:r>
     </w:p>
     <w:p>
@@ -2178,6 +2093,7 @@
       </w:pPr>
       <w:bookmarkStart w:id="14" w:name="_Toc103152781"/>
       <w:r>
+        <w:lastRenderedPageBreak/>
         <w:t>Säkerhet</w:t>
       </w:r>
       <w:bookmarkEnd w:id="14"/>
@@ -2194,44 +2110,12 @@
     </w:p>
     <w:p>
       <w:r>
-        <w:t xml:space="preserve">Alla filer lagras i ett </w:t>
-      </w:r>
-      <w:proofErr w:type="spellStart"/>
-      <w:r>
-        <w:t>githubrepository</w:t>
-      </w:r>
-      <w:proofErr w:type="spellEnd"/>
-      <w:r>
-        <w:t xml:space="preserve"> så att olika kodgenerationer lätt kan hanteras och projektet kan återskapas i händelse av en hårddisk </w:t>
-      </w:r>
-      <w:proofErr w:type="spellStart"/>
-      <w:r>
-        <w:t>krash</w:t>
-      </w:r>
-      <w:proofErr w:type="spellEnd"/>
-      <w:r>
-        <w:t xml:space="preserve"> eller om man vill göra utvecklingen på flera datorer (med flera användare).</w:t>
+        <w:t>Alla filer lagras i ett githubrepository så att olika kodgenerationer lätt kan hanteras och projektet kan återskapas i händelse av en hårddisk krash eller om man vill göra utvecklingen på flera datorer (med flera användare).</w:t>
       </w:r>
     </w:p>
     <w:p>
       <w:r>
-        <w:t>Databasen-</w:t>
-      </w:r>
-      <w:proofErr w:type="spellStart"/>
-      <w:r>
-        <w:t>backupas</w:t>
-      </w:r>
-      <w:proofErr w:type="spellEnd"/>
-      <w:r>
-        <w:t xml:space="preserve"> med jämna mellanrum som en </w:t>
-      </w:r>
-      <w:proofErr w:type="spellStart"/>
-      <w:r>
-        <w:t>dump</w:t>
-      </w:r>
-      <w:proofErr w:type="spellEnd"/>
-      <w:r>
-        <w:t xml:space="preserve"> som också sparas i projektmappen.</w:t>
+        <w:t>Databasen-backupas med jämna mellanrum som en dump som också sparas i projektmappen.</w:t>
       </w:r>
     </w:p>
     <w:p>
@@ -2246,23 +2130,7 @@
     </w:p>
     <w:p>
       <w:r>
-        <w:t xml:space="preserve">Kodbasen är ej tillgänglig på </w:t>
-      </w:r>
-      <w:proofErr w:type="spellStart"/>
-      <w:r>
-        <w:t>github</w:t>
-      </w:r>
-      <w:proofErr w:type="spellEnd"/>
-      <w:r>
-        <w:t xml:space="preserve"> eftersom det är ett privat-</w:t>
-      </w:r>
-      <w:proofErr w:type="spellStart"/>
-      <w:r>
-        <w:t>repository</w:t>
-      </w:r>
-      <w:proofErr w:type="spellEnd"/>
-      <w:r>
-        <w:t>.</w:t>
+        <w:t>Kodbasen är ej tillgänglig på github eftersom det är ett privat-repository.</w:t>
       </w:r>
     </w:p>
     <w:p>
@@ -2272,7 +2140,7 @@
     </w:p>
     <w:p/>
     <w:sectPr>
-      <w:footerReference w:type="default" r:id="rId14"/>
+      <w:footerReference w:type="default" r:id="rId16"/>
       <w:pgSz w:w="11906" w:h="16838" w:code="9"/>
       <w:pgMar w:top="1440" w:right="1639" w:bottom="1440" w:left="1639" w:header="720" w:footer="720" w:gutter="0"/>
       <w:pgNumType w:start="0"/>
@@ -4877,8 +4745,10 @@
   <w:rsids>
     <w:rsidRoot w:val="00BF00B4"/>
     <w:rsid w:val="001E75FC"/>
+    <w:rsid w:val="00290273"/>
     <w:rsid w:val="007769DA"/>
     <w:rsid w:val="007D257D"/>
+    <w:rsid w:val="00925C3C"/>
     <w:rsid w:val="009F6C70"/>
     <w:rsid w:val="00BF00B4"/>
     <w:rsid w:val="00F5306C"/>
@@ -5653,10 +5523,6 @@
 </file>
 
 <file path=customXml/item1.xml><?xml version="1.0" encoding="utf-8"?>
-<b:Sources xmlns:b="http://schemas.openxmlformats.org/officeDocument/2006/bibliography" xmlns="http://schemas.openxmlformats.org/officeDocument/2006/bibliography" SelectedStyle="\APASixthEditionOfficeOnline.xsl" StyleName="APA" Version="6"/>
-</file>
-
-<file path=customXml/item2.xml><?xml version="1.0" encoding="utf-8"?>
 <ct:contentTypeSchema xmlns:ct="http://schemas.microsoft.com/office/2006/metadata/contentType" xmlns:ma="http://schemas.microsoft.com/office/2006/metadata/properties/metaAttributes" ct:_="" ma:_="" ma:contentTypeName="dokument" ma:contentTypeID="0x01010067B035B7DE360F49AC1E3E64A7BD4266" ma:contentTypeVersion="9" ma:contentTypeDescription="Skapa ett nytt dokument." ma:contentTypeScope="" ma:versionID="2b15be16484cc4125e56b4bc62a7d78a">
   <xsd:schema xmlns:xsd="http://www.w3.org/2001/XMLSchema" xmlns:xs="http://www.w3.org/2001/XMLSchema" xmlns:p="http://schemas.microsoft.com/office/2006/metadata/properties" xmlns:ns3="e726d1de-8eee-48d4-acc6-11f5952e6685" xmlns:ns4="7afd1d53-ab43-4087-8ee5-8d1641b94b01" targetNamespace="http://schemas.microsoft.com/office/2006/metadata/properties" ma:root="true" ma:fieldsID="07a74a5b6f94ee7a3fc8de3bd0e980eb" ns3:_="" ns4:_="">
     <xsd:import namespace="e726d1de-8eee-48d4-acc6-11f5952e6685"/>
@@ -5853,7 +5719,17 @@
 </ct:contentTypeSchema>
 </file>
 
+<file path=customXml/item2.xml><?xml version="1.0" encoding="utf-8"?>
+<b:Sources xmlns:b="http://schemas.openxmlformats.org/officeDocument/2006/bibliography" xmlns="http://schemas.openxmlformats.org/officeDocument/2006/bibliography" SelectedStyle="\APASixthEditionOfficeOnline.xsl" StyleName="APA" Version="6"/>
+</file>
+
 <file path=customXml/item3.xml><?xml version="1.0" encoding="utf-8"?>
+<p:properties xmlns:p="http://schemas.microsoft.com/office/2006/metadata/properties" xmlns:xsi="http://www.w3.org/2001/XMLSchema-instance" xmlns:pc="http://schemas.microsoft.com/office/infopath/2007/PartnerControls">
+  <documentManagement/>
+</p:properties>
+</file>
+
+<file path=customXml/item4.xml><?xml version="1.0" encoding="utf-8"?>
 <?mso-contentType ?>
 <FormTemplates xmlns="http://schemas.microsoft.com/sharepoint/v3/contenttype/forms">
   <Display>DocumentLibraryForm</Display>
@@ -5862,21 +5738,7 @@
 </FormTemplates>
 </file>
 
-<file path=customXml/item4.xml><?xml version="1.0" encoding="utf-8"?>
-<p:properties xmlns:p="http://schemas.microsoft.com/office/2006/metadata/properties" xmlns:xsi="http://www.w3.org/2001/XMLSchema-instance" xmlns:pc="http://schemas.microsoft.com/office/infopath/2007/PartnerControls">
-  <documentManagement/>
-</p:properties>
-</file>
-
 <file path=customXml/itemProps1.xml><?xml version="1.0" encoding="utf-8"?>
-<ds:datastoreItem xmlns:ds="http://schemas.openxmlformats.org/officeDocument/2006/customXml" ds:itemID="{F95BC9C0-4309-42B6-A692-27E3D4821FE6}">
-  <ds:schemaRefs>
-    <ds:schemaRef ds:uri="http://schemas.openxmlformats.org/officeDocument/2006/bibliography"/>
-  </ds:schemaRefs>
-</ds:datastoreItem>
-</file>
-
-<file path=customXml/itemProps2.xml><?xml version="1.0" encoding="utf-8"?>
 <ds:datastoreItem xmlns:ds="http://schemas.openxmlformats.org/officeDocument/2006/customXml" ds:itemID="{9E68415D-8571-4C4E-9D5B-26AF09ED893B}">
   <ds:schemaRefs>
     <ds:schemaRef ds:uri="http://schemas.microsoft.com/office/2006/metadata/contentType"/>
@@ -5895,19 +5757,27 @@
 </ds:datastoreItem>
 </file>
 
-<file path=customXml/itemProps3.xml><?xml version="1.0" encoding="utf-8"?>
-<ds:datastoreItem xmlns:ds="http://schemas.openxmlformats.org/officeDocument/2006/customXml" ds:itemID="{9DD392A4-9C7B-47E9-A2A7-2EC9259DC515}">
+<file path=customXml/itemProps2.xml><?xml version="1.0" encoding="utf-8"?>
+<ds:datastoreItem xmlns:ds="http://schemas.openxmlformats.org/officeDocument/2006/customXml" ds:itemID="{F95BC9C0-4309-42B6-A692-27E3D4821FE6}">
   <ds:schemaRefs>
-    <ds:schemaRef ds:uri="http://schemas.microsoft.com/sharepoint/v3/contenttype/forms"/>
+    <ds:schemaRef ds:uri="http://schemas.openxmlformats.org/officeDocument/2006/bibliography"/>
   </ds:schemaRefs>
 </ds:datastoreItem>
 </file>
 
-<file path=customXml/itemProps4.xml><?xml version="1.0" encoding="utf-8"?>
+<file path=customXml/itemProps3.xml><?xml version="1.0" encoding="utf-8"?>
 <ds:datastoreItem xmlns:ds="http://schemas.openxmlformats.org/officeDocument/2006/customXml" ds:itemID="{12E72A48-7A3C-4AA9-A41C-71D022C7FFC5}">
   <ds:schemaRefs>
     <ds:schemaRef ds:uri="http://schemas.microsoft.com/office/2006/metadata/properties"/>
     <ds:schemaRef ds:uri="http://schemas.microsoft.com/office/infopath/2007/PartnerControls"/>
   </ds:schemaRefs>
 </ds:datastoreItem>
+</file>
+
+<file path=customXml/itemProps4.xml><?xml version="1.0" encoding="utf-8"?>
+<ds:datastoreItem xmlns:ds="http://schemas.openxmlformats.org/officeDocument/2006/customXml" ds:itemID="{9DD392A4-9C7B-47E9-A2A7-2EC9259DC515}">
+  <ds:schemaRefs>
+    <ds:schemaRef ds:uri="http://schemas.microsoft.com/sharepoint/v3/contenttype/forms"/>
+  </ds:schemaRefs>
+</ds:datastoreItem>
 </file>
</xml_diff>